<commit_message>
docs: update CASE_STUDY.docx with latest author edits
Made-with: Cursor
</commit_message>
<xml_diff>
--- a/CASE_STUDY.docx
+++ b/CASE_STUDY.docx
@@ -53,6 +53,8 @@
         <w:jc w:val="center"/>
         <w:rPr>
           <w:rFonts w:cs="Times New Roman"/>
+          <w:i/>
+          <w:color w:val="555555"/>
         </w:rPr>
       </w:pPr>
       <w:r>
@@ -63,6 +65,82 @@
         </w:rPr>
         <w:t>PrunableMixer: an MLP-Mixer variant whose every linear layer owns a learnable sigmoid gate, trained end-to-end on CIFAR-10 with an L1 sparsity regulariser. The network learns -- by itself -- which of its 57 M weights are worth keeping.</w:t>
       </w:r>
+    </w:p>
+    <w:p>
+      <w:pPr>
+        <w:spacing w:after="280"/>
+        <w:jc w:val="center"/>
+        <w:rPr>
+          <w:rFonts w:cs="Times New Roman"/>
+          <w:b/>
+          <w:bCs/>
+          <w:iCs/>
+          <w:color w:val="000000" w:themeColor="text1"/>
+          <w:sz w:val="28"/>
+          <w:szCs w:val="28"/>
+        </w:rPr>
+      </w:pPr>
+      <w:r>
+        <w:rPr>
+          <w:rFonts w:cs="Times New Roman"/>
+          <w:b/>
+          <w:bCs/>
+          <w:iCs/>
+          <w:color w:val="000000" w:themeColor="text1"/>
+          <w:sz w:val="28"/>
+          <w:szCs w:val="28"/>
+        </w:rPr>
+        <w:t>HARSHIT KULKARNI[RA2311003011810]</w:t>
+      </w:r>
+    </w:p>
+    <w:p>
+      <w:pPr>
+        <w:spacing w:after="280"/>
+        <w:jc w:val="center"/>
+        <w:rPr>
+          <w:rFonts w:cs="Times New Roman"/>
+          <w:iCs/>
+          <w:color w:val="555555"/>
+          <w:sz w:val="24"/>
+          <w:szCs w:val="24"/>
+        </w:rPr>
+      </w:pPr>
+      <w:hyperlink r:id="rId8" w:history="1">
+        <w:r>
+          <w:rPr>
+            <w:rStyle w:val="Hyperlink"/>
+            <w:rFonts w:cs="Times New Roman"/>
+            <w:iCs/>
+            <w:sz w:val="24"/>
+            <w:szCs w:val="24"/>
+          </w:rPr>
+          <w:t>Kulharshit21@gmail.com</w:t>
+        </w:r>
+      </w:hyperlink>
+    </w:p>
+    <w:p>
+      <w:pPr>
+        <w:spacing w:after="280"/>
+        <w:jc w:val="center"/>
+        <w:rPr>
+          <w:rFonts w:cs="Times New Roman"/>
+          <w:iCs/>
+          <w:sz w:val="24"/>
+          <w:szCs w:val="24"/>
+        </w:rPr>
+      </w:pPr>
+      <w:hyperlink r:id="rId9" w:history="1">
+        <w:r>
+          <w:rPr>
+            <w:rStyle w:val="Hyperlink"/>
+            <w:rFonts w:cs="Times New Roman"/>
+            <w:iCs/>
+            <w:sz w:val="24"/>
+            <w:szCs w:val="24"/>
+          </w:rPr>
+          <w:t>https://github.com/kulharshit21/self-pruning-prunable-mixer-cifar10/tree/main</w:t>
+        </w:r>
+      </w:hyperlink>
     </w:p>
     <w:p>
       <w:pPr>
@@ -215,6 +293,7 @@
         <w:rPr>
           <w:rFonts w:ascii="Times New Roman" w:hAnsi="Times New Roman" w:cs="Times New Roman"/>
         </w:rPr>
+        <w:lastRenderedPageBreak/>
         <w:t>3.  Architecture: PrunableMixer</w:t>
       </w:r>
     </w:p>
@@ -257,14 +336,7 @@
           <w:rFonts w:cs="Times New Roman"/>
         </w:rPr>
         <w:br/>
-        <w:t xml:space="preserve">- 12 MixerBlocks, each with a token-mixing MLP (PrunableLinear 64 -&gt; 256 -&gt; 64) and a channel-mixing </w:t>
-      </w:r>
-      <w:r>
-        <w:rPr>
-          <w:rFonts w:cs="Times New Roman"/>
-        </w:rPr>
-        <w:lastRenderedPageBreak/>
-        <w:t>MLP (PrunableLinear 768 -&gt; 3072 -&gt; 768).</w:t>
+        <w:t>- 12 MixerBlocks, each with a token-mixing MLP (PrunableLinear 64 -&gt; 256 -&gt; 64) and a channel-mixing MLP (PrunableLinear 768 -&gt; 3072 -&gt; 768).</w:t>
       </w:r>
       <w:r>
         <w:rPr>
@@ -1011,6 +1083,7 @@
         <w:rPr>
           <w:rFonts w:ascii="Times New Roman" w:hAnsi="Times New Roman" w:cs="Times New Roman"/>
         </w:rPr>
+        <w:lastRenderedPageBreak/>
         <w:t>5.1  Gate distribution at the best operating point</w:t>
       </w:r>
     </w:p>
@@ -1042,7 +1115,7 @@
                     <pic:cNvPicPr/>
                   </pic:nvPicPr>
                   <pic:blipFill>
-                    <a:blip r:embed="rId6"/>
+                    <a:blip r:embed="rId10"/>
                     <a:stretch>
                       <a:fillRect/>
                     </a:stretch>
@@ -1078,7 +1151,6 @@
           <w:color w:val="555555"/>
           <w:sz w:val="19"/>
         </w:rPr>
-        <w:lastRenderedPageBreak/>
         <w:t>Figure 1 -- Final gate histogram at lambda = 1e-6 (88.9% sparsity). The strong mode at zero and the thin tail above the 1e-2 threshold are exactly the bimodal signature the brief asks for.</w:t>
       </w:r>
     </w:p>
@@ -1124,7 +1196,7 @@
                     <pic:cNvPicPr/>
                   </pic:nvPicPr>
                   <pic:blipFill>
-                    <a:blip r:embed="rId7"/>
+                    <a:blip r:embed="rId11"/>
                     <a:stretch>
                       <a:fillRect/>
                     </a:stretch>
@@ -1174,6 +1246,7 @@
         <w:rPr>
           <w:rFonts w:ascii="Times New Roman" w:hAnsi="Times New Roman" w:cs="Times New Roman"/>
         </w:rPr>
+        <w:lastRenderedPageBreak/>
         <w:t>5.3  The lambda trade-off</w:t>
       </w:r>
     </w:p>
@@ -1205,7 +1278,7 @@
                     <pic:cNvPicPr/>
                   </pic:nvPicPr>
                   <pic:blipFill>
-                    <a:blip r:embed="rId8"/>
+                    <a:blip r:embed="rId12"/>
                     <a:stretch>
                       <a:fillRect/>
                     </a:stretch>
@@ -1255,7 +1328,6 @@
         <w:rPr>
           <w:rFonts w:ascii="Times New Roman" w:hAnsi="Times New Roman" w:cs="Times New Roman"/>
         </w:rPr>
-        <w:lastRenderedPageBreak/>
         <w:t>5.4  Per-layer and per-path analysis</w:t>
       </w:r>
     </w:p>
@@ -1287,7 +1359,7 @@
                     <pic:cNvPicPr/>
                   </pic:nvPicPr>
                   <pic:blipFill>
-                    <a:blip r:embed="rId9"/>
+                    <a:blip r:embed="rId13"/>
                     <a:stretch>
                       <a:fillRect/>
                     </a:stretch>
@@ -1338,6 +1410,7 @@
           <w:rFonts w:cs="Times New Roman"/>
           <w:noProof/>
         </w:rPr>
+        <w:lastRenderedPageBreak/>
         <w:drawing>
           <wp:inline distT="0" distB="0" distL="0" distR="0" wp14:anchorId="47BB0335" wp14:editId="6C76EDC8">
             <wp:extent cx="5486400" cy="2901131"/>
@@ -1354,7 +1427,7 @@
                     <pic:cNvPicPr/>
                   </pic:nvPicPr>
                   <pic:blipFill>
-                    <a:blip r:embed="rId10"/>
+                    <a:blip r:embed="rId14"/>
                     <a:stretch>
                       <a:fillRect/>
                     </a:stretch>
@@ -1404,7 +1477,6 @@
         <w:rPr>
           <w:rFonts w:ascii="Times New Roman" w:hAnsi="Times New Roman" w:cs="Times New Roman"/>
         </w:rPr>
-        <w:lastRenderedPageBreak/>
         <w:t>5.5  Progressive-threshold study</w:t>
       </w:r>
     </w:p>
@@ -1436,7 +1508,7 @@
                     <pic:cNvPicPr/>
                   </pic:nvPicPr>
                   <pic:blipFill>
-                    <a:blip r:embed="rId11"/>
+                    <a:blip r:embed="rId15"/>
                     <a:stretch>
                       <a:fillRect/>
                     </a:stretch>
@@ -1517,7 +1589,7 @@
                     <pic:cNvPicPr/>
                   </pic:nvPicPr>
                   <pic:blipFill>
-                    <a:blip r:embed="rId12"/>
+                    <a:blip r:embed="rId16"/>
                     <a:stretch>
                       <a:fillRect/>
                     </a:stretch>
@@ -1553,6 +1625,7 @@
           <w:color w:val="555555"/>
           <w:sz w:val="19"/>
         </w:rPr>
+        <w:lastRenderedPageBreak/>
         <w:t>Figure 7 -- Scatter of |weight| vs. gate value for a random sample of 200 k weights. The pruned cluster on the left proves that gates do not merely copy weight magnitude -- the network assigns importance jointly.</w:t>
       </w:r>
     </w:p>
@@ -1598,7 +1671,7 @@
                     <pic:cNvPicPr/>
                   </pic:nvPicPr>
                   <pic:blipFill>
-                    <a:blip r:embed="rId13"/>
+                    <a:blip r:embed="rId17"/>
                     <a:stretch>
                       <a:fillRect/>
                     </a:stretch>
@@ -1634,7 +1707,6 @@
           <w:color w:val="555555"/>
           <w:sz w:val="19"/>
         </w:rPr>
-        <w:lastRenderedPageBreak/>
         <w:t>Figure 8 -- Training throughput per epoch. Average across the three runs: 6,410 samples/second on a single H100 80 GB.</w:t>
       </w:r>
     </w:p>
@@ -1680,7 +1752,7 @@
                     <pic:cNvPicPr/>
                   </pic:nvPicPr>
                   <pic:blipFill>
-                    <a:blip r:embed="rId14"/>
+                    <a:blip r:embed="rId18"/>
                     <a:stretch>
                       <a:fillRect/>
                     </a:stretch>
@@ -1758,6 +1830,7 @@
         <w:rPr>
           <w:rFonts w:ascii="Times New Roman" w:hAnsi="Times New Roman" w:cs="Times New Roman"/>
         </w:rPr>
+        <w:lastRenderedPageBreak/>
         <w:t>7.  Reproducibility</w:t>
       </w:r>
     </w:p>
@@ -1794,13 +1867,123 @@
       </w:r>
     </w:p>
     <w:sectPr>
+      <w:footerReference w:type="default" r:id="rId19"/>
       <w:pgSz w:w="12240" w:h="15840"/>
       <w:pgMar w:top="1134" w:right="1247" w:bottom="1134" w:left="1247" w:header="720" w:footer="720" w:gutter="0"/>
+      <w:pgBorders w:offsetFrom="page">
+        <w:top w:val="single" w:sz="4" w:space="24" w:color="auto"/>
+        <w:left w:val="single" w:sz="4" w:space="24" w:color="auto"/>
+        <w:bottom w:val="single" w:sz="4" w:space="24" w:color="auto"/>
+        <w:right w:val="single" w:sz="4" w:space="24" w:color="auto"/>
+      </w:pgBorders>
       <w:cols w:space="720"/>
       <w:docGrid w:linePitch="360"/>
     </w:sectPr>
   </w:body>
 </w:document>
+</file>
+
+<file path=word/endnotes.xml><?xml version="1.0" encoding="utf-8"?>
+<w:endnotes xmlns:wpc="http://schemas.microsoft.com/office/word/2010/wordprocessingCanvas" xmlns:cx="http://schemas.microsoft.com/office/drawing/2014/chartex" xmlns:cx1="http://schemas.microsoft.com/office/drawing/2015/9/8/chartex" xmlns:cx2="http://schemas.microsoft.com/office/drawing/2015/10/21/chartex" xmlns:cx3="http://schemas.microsoft.com/office/drawing/2016/5/9/chartex" xmlns:cx4="http://schemas.microsoft.com/office/drawing/2016/5/10/chartex" xmlns:cx5="http://schemas.microsoft.com/office/drawing/2016/5/11/chartex" xmlns:cx6="http://schemas.microsoft.com/office/drawing/2016/5/12/chartex" xmlns:cx7="http://schemas.microsoft.com/office/drawing/2016/5/13/chartex" xmlns:cx8="http://schemas.microsoft.com/office/drawing/2016/5/14/chartex" xmlns:mc="http://schemas.openxmlformats.org/markup-compatibility/2006" xmlns:aink="http://schemas.microsoft.com/office/drawing/2016/ink" xmlns:am3d="http://schemas.microsoft.com/office/drawing/2017/model3d" xmlns:o="urn:schemas-microsoft-com:office:office" xmlns:oel="http://schemas.microsoft.com/office/2019/extlst" xmlns:r="http://schemas.openxmlformats.org/officeDocument/2006/relationships" xmlns:m="http://schemas.openxmlformats.org/officeDocument/2006/math" xmlns:v="urn:schemas-microsoft-com:vml" xmlns:wp14="http://schemas.microsoft.com/office/word/2010/wordprocessingDrawing" xmlns:wp="http://schemas.openxmlformats.org/drawingml/2006/wordprocessingDrawing" xmlns:w10="urn:schemas-microsoft-com:office:word" xmlns:w="http://schemas.openxmlformats.org/wordprocessingml/2006/main" xmlns:w14="http://schemas.microsoft.com/office/word/2010/wordml" xmlns:w15="http://schemas.microsoft.com/office/word/2012/wordml" xmlns:w16cex="http://schemas.microsoft.com/office/word/2018/wordml/cex" xmlns:w16cid="http://schemas.microsoft.com/office/word/2016/wordml/cid" xmlns:w16="http://schemas.microsoft.com/office/word/2018/wordml" xmlns:w16du="http://schemas.microsoft.com/office/word/2023/wordml/word16du" xmlns:w16sdtdh="http://schemas.microsoft.com/office/word/2020/wordml/sdtdatahash" xmlns:w16sdtfl="http://schemas.microsoft.com/office/word/2024/wordml/sdtformatlock" xmlns:w16se="http://schemas.microsoft.com/office/word/2015/wordml/symex" xmlns:wpg="http://schemas.microsoft.com/office/word/2010/wordprocessingGroup" xmlns:wpi="http://schemas.microsoft.com/office/word/2010/wordprocessingInk" xmlns:wne="http://schemas.microsoft.com/office/word/2006/wordml" xmlns:wps="http://schemas.microsoft.com/office/word/2010/wordprocessingShape" mc:Ignorable="w14 w15 w16se w16cid w16 w16cex w16sdtdh w16sdtfl w16du wp14">
+  <w:endnote w:type="separator" w:id="-1">
+    <w:p>
+      <w:pPr>
+        <w:spacing w:after="0" w:line="240" w:lineRule="auto"/>
+      </w:pPr>
+      <w:r>
+        <w:separator/>
+      </w:r>
+    </w:p>
+  </w:endnote>
+  <w:endnote w:type="continuationSeparator" w:id="0">
+    <w:p>
+      <w:pPr>
+        <w:spacing w:after="0" w:line="240" w:lineRule="auto"/>
+      </w:pPr>
+      <w:r>
+        <w:continuationSeparator/>
+      </w:r>
+    </w:p>
+  </w:endnote>
+</w:endnotes>
+</file>
+
+<file path=word/footer1.xml><?xml version="1.0" encoding="utf-8"?>
+<w:ftr xmlns:wpc="http://schemas.microsoft.com/office/word/2010/wordprocessingCanvas" xmlns:cx="http://schemas.microsoft.com/office/drawing/2014/chartex" xmlns:cx1="http://schemas.microsoft.com/office/drawing/2015/9/8/chartex" xmlns:cx2="http://schemas.microsoft.com/office/drawing/2015/10/21/chartex" xmlns:cx3="http://schemas.microsoft.com/office/drawing/2016/5/9/chartex" xmlns:cx4="http://schemas.microsoft.com/office/drawing/2016/5/10/chartex" xmlns:cx5="http://schemas.microsoft.com/office/drawing/2016/5/11/chartex" xmlns:cx6="http://schemas.microsoft.com/office/drawing/2016/5/12/chartex" xmlns:cx7="http://schemas.microsoft.com/office/drawing/2016/5/13/chartex" xmlns:cx8="http://schemas.microsoft.com/office/drawing/2016/5/14/chartex" xmlns:mc="http://schemas.openxmlformats.org/markup-compatibility/2006" xmlns:aink="http://schemas.microsoft.com/office/drawing/2016/ink" xmlns:am3d="http://schemas.microsoft.com/office/drawing/2017/model3d" xmlns:o="urn:schemas-microsoft-com:office:office" xmlns:oel="http://schemas.microsoft.com/office/2019/extlst" xmlns:r="http://schemas.openxmlformats.org/officeDocument/2006/relationships" xmlns:m="http://schemas.openxmlformats.org/officeDocument/2006/math" xmlns:v="urn:schemas-microsoft-com:vml" xmlns:wp14="http://schemas.microsoft.com/office/word/2010/wordprocessingDrawing" xmlns:wp="http://schemas.openxmlformats.org/drawingml/2006/wordprocessingDrawing" xmlns:w10="urn:schemas-microsoft-com:office:word" xmlns:w="http://schemas.openxmlformats.org/wordprocessingml/2006/main" xmlns:w14="http://schemas.microsoft.com/office/word/2010/wordml" xmlns:w15="http://schemas.microsoft.com/office/word/2012/wordml" xmlns:w16cex="http://schemas.microsoft.com/office/word/2018/wordml/cex" xmlns:w16cid="http://schemas.microsoft.com/office/word/2016/wordml/cid" xmlns:w16="http://schemas.microsoft.com/office/word/2018/wordml" xmlns:w16du="http://schemas.microsoft.com/office/word/2023/wordml/word16du" xmlns:w16sdtdh="http://schemas.microsoft.com/office/word/2020/wordml/sdtdatahash" xmlns:w16sdtfl="http://schemas.microsoft.com/office/word/2024/wordml/sdtformatlock" xmlns:w16se="http://schemas.microsoft.com/office/word/2015/wordml/symex" xmlns:wpg="http://schemas.microsoft.com/office/word/2010/wordprocessingGroup" xmlns:wpi="http://schemas.microsoft.com/office/word/2010/wordprocessingInk" xmlns:wne="http://schemas.microsoft.com/office/word/2006/wordml" xmlns:wps="http://schemas.microsoft.com/office/word/2010/wordprocessingShape" mc:Ignorable="w14 w15 w16se w16cid w16 w16cex w16sdtdh w16sdtfl w16du wp14">
+  <w:sdt>
+    <w:sdtPr>
+      <w:id w:val="-439374115"/>
+      <w:docPartObj>
+        <w:docPartGallery w:val="Page Numbers (Bottom of Page)"/>
+        <w:docPartUnique/>
+      </w:docPartObj>
+    </w:sdtPr>
+    <w:sdtEndPr>
+      <w:rPr>
+        <w:noProof/>
+      </w:rPr>
+    </w:sdtEndPr>
+    <w:sdtContent>
+      <w:p>
+        <w:pPr>
+          <w:pStyle w:val="Footer"/>
+          <w:jc w:val="center"/>
+        </w:pPr>
+        <w:r>
+          <w:fldChar w:fldCharType="begin"/>
+        </w:r>
+        <w:r>
+          <w:instrText xml:space="preserve"> PAGE   \* MERGEFORMAT </w:instrText>
+        </w:r>
+        <w:r>
+          <w:fldChar w:fldCharType="separate"/>
+        </w:r>
+        <w:r>
+          <w:rPr>
+            <w:noProof/>
+          </w:rPr>
+          <w:t>2</w:t>
+        </w:r>
+        <w:r>
+          <w:rPr>
+            <w:noProof/>
+          </w:rPr>
+          <w:fldChar w:fldCharType="end"/>
+        </w:r>
+      </w:p>
+    </w:sdtContent>
+  </w:sdt>
+  <w:p>
+    <w:pPr>
+      <w:pStyle w:val="Footer"/>
+    </w:pPr>
+  </w:p>
+</w:ftr>
+</file>
+
+<file path=word/footnotes.xml><?xml version="1.0" encoding="utf-8"?>
+<w:footnotes xmlns:wpc="http://schemas.microsoft.com/office/word/2010/wordprocessingCanvas" xmlns:cx="http://schemas.microsoft.com/office/drawing/2014/chartex" xmlns:cx1="http://schemas.microsoft.com/office/drawing/2015/9/8/chartex" xmlns:cx2="http://schemas.microsoft.com/office/drawing/2015/10/21/chartex" xmlns:cx3="http://schemas.microsoft.com/office/drawing/2016/5/9/chartex" xmlns:cx4="http://schemas.microsoft.com/office/drawing/2016/5/10/chartex" xmlns:cx5="http://schemas.microsoft.com/office/drawing/2016/5/11/chartex" xmlns:cx6="http://schemas.microsoft.com/office/drawing/2016/5/12/chartex" xmlns:cx7="http://schemas.microsoft.com/office/drawing/2016/5/13/chartex" xmlns:cx8="http://schemas.microsoft.com/office/drawing/2016/5/14/chartex" xmlns:mc="http://schemas.openxmlformats.org/markup-compatibility/2006" xmlns:aink="http://schemas.microsoft.com/office/drawing/2016/ink" xmlns:am3d="http://schemas.microsoft.com/office/drawing/2017/model3d" xmlns:o="urn:schemas-microsoft-com:office:office" xmlns:oel="http://schemas.microsoft.com/office/2019/extlst" xmlns:r="http://schemas.openxmlformats.org/officeDocument/2006/relationships" xmlns:m="http://schemas.openxmlformats.org/officeDocument/2006/math" xmlns:v="urn:schemas-microsoft-com:vml" xmlns:wp14="http://schemas.microsoft.com/office/word/2010/wordprocessingDrawing" xmlns:wp="http://schemas.openxmlformats.org/drawingml/2006/wordprocessingDrawing" xmlns:w10="urn:schemas-microsoft-com:office:word" xmlns:w="http://schemas.openxmlformats.org/wordprocessingml/2006/main" xmlns:w14="http://schemas.microsoft.com/office/word/2010/wordml" xmlns:w15="http://schemas.microsoft.com/office/word/2012/wordml" xmlns:w16cex="http://schemas.microsoft.com/office/word/2018/wordml/cex" xmlns:w16cid="http://schemas.microsoft.com/office/word/2016/wordml/cid" xmlns:w16="http://schemas.microsoft.com/office/word/2018/wordml" xmlns:w16du="http://schemas.microsoft.com/office/word/2023/wordml/word16du" xmlns:w16sdtdh="http://schemas.microsoft.com/office/word/2020/wordml/sdtdatahash" xmlns:w16sdtfl="http://schemas.microsoft.com/office/word/2024/wordml/sdtformatlock" xmlns:w16se="http://schemas.microsoft.com/office/word/2015/wordml/symex" xmlns:wpg="http://schemas.microsoft.com/office/word/2010/wordprocessingGroup" xmlns:wpi="http://schemas.microsoft.com/office/word/2010/wordprocessingInk" xmlns:wne="http://schemas.microsoft.com/office/word/2006/wordml" xmlns:wps="http://schemas.microsoft.com/office/word/2010/wordprocessingShape" mc:Ignorable="w14 w15 w16se w16cid w16 w16cex w16sdtdh w16sdtfl w16du wp14">
+  <w:footnote w:type="separator" w:id="-1">
+    <w:p>
+      <w:pPr>
+        <w:spacing w:after="0" w:line="240" w:lineRule="auto"/>
+      </w:pPr>
+      <w:r>
+        <w:separator/>
+      </w:r>
+    </w:p>
+  </w:footnote>
+  <w:footnote w:type="continuationSeparator" w:id="0">
+    <w:p>
+      <w:pPr>
+        <w:spacing w:after="0" w:line="240" w:lineRule="auto"/>
+      </w:pPr>
+      <w:r>
+        <w:continuationSeparator/>
+      </w:r>
+    </w:p>
+  </w:footnote>
+</w:footnotes>
 </file>
 
 <file path=word/numbering.xml><?xml version="1.0" encoding="utf-8"?>
@@ -13389,6 +13572,29 @@
       </w:tcPr>
     </w:tblStylePr>
   </w:style>
+  <w:style w:type="character" w:styleId="Hyperlink">
+    <w:name w:val="Hyperlink"/>
+    <w:basedOn w:val="DefaultParagraphFont"/>
+    <w:uiPriority w:val="99"/>
+    <w:unhideWhenUsed/>
+    <w:rsid w:val="00315C62"/>
+    <w:rPr>
+      <w:color w:val="0000FF" w:themeColor="hyperlink"/>
+      <w:u w:val="single"/>
+    </w:rPr>
+  </w:style>
+  <w:style w:type="character" w:styleId="UnresolvedMention">
+    <w:name w:val="Unresolved Mention"/>
+    <w:basedOn w:val="DefaultParagraphFont"/>
+    <w:uiPriority w:val="99"/>
+    <w:semiHidden/>
+    <w:unhideWhenUsed/>
+    <w:rsid w:val="00315C62"/>
+    <w:rPr>
+      <w:color w:val="605E5C"/>
+      <w:shd w:val="clear" w:color="auto" w:fill="E1DFDD"/>
+    </w:rPr>
+  </w:style>
 </w:styles>
 </file>
 

</xml_diff>